<commit_message>
added kubernetes and jenkins
</commit_message>
<xml_diff>
--- a/new_resume.docx
+++ b/new_resume.docx
@@ -200,25 +200,25 @@
         <w:t xml:space="preserve"> </w:t>
       </w:r>
       <w:r>
-        <w:t xml:space="preserve">Ansible Tower / AWX,</w:t>
-      </w:r>
-      <w:r>
-        <w:t xml:space="preserve"> </w:t>
-      </w:r>
-      <w:r>
-        <w:t xml:space="preserve">Nagios, Cacti, Spacewalk / Satellite / SUSE Manager,</w:t>
-      </w:r>
-      <w:r>
-        <w:t xml:space="preserve"> </w:t>
-      </w:r>
-      <w:r>
-        <w:t xml:space="preserve">NextCloud, Grafana, Prometheus and node-exporter,</w:t>
-      </w:r>
-      <w:r>
-        <w:t xml:space="preserve"> </w:t>
-      </w:r>
-      <w:r>
-        <w:t xml:space="preserve">Jenkins, Gitea, Apache Guacamole</w:t>
+        <w:t xml:space="preserve">Jenkins, Ansible</w:t>
+      </w:r>
+      <w:r>
+        <w:t xml:space="preserve"> </w:t>
+      </w:r>
+      <w:r>
+        <w:t xml:space="preserve">Tower / AWX, Nagios, Cacti, Spacewalk / Satellite / SUSE</w:t>
+      </w:r>
+      <w:r>
+        <w:t xml:space="preserve"> </w:t>
+      </w:r>
+      <w:r>
+        <w:t xml:space="preserve">Manager, NextCloud, Grafana, Prometheus and</w:t>
+      </w:r>
+      <w:r>
+        <w:t xml:space="preserve"> </w:t>
+      </w:r>
+      <w:r>
+        <w:t xml:space="preserve">node-exporter, Jenkins, Gitea, Apache Guacamole</w:t>
       </w:r>
     </w:p>
     <w:p>
@@ -240,31 +240,37 @@
         <w:t xml:space="preserve"> </w:t>
       </w:r>
       <w:r>
-        <w:t xml:space="preserve">Git, AWS (cloud), Docker,</w:t>
-      </w:r>
-      <w:r>
-        <w:t xml:space="preserve"> </w:t>
-      </w:r>
-      <w:r>
-        <w:t xml:space="preserve">KVM, Xen, IPv4, IPv6, Linux Netfilter, ipfilter, OpenBSD</w:t>
-      </w:r>
-      <w:r>
-        <w:t xml:space="preserve"> </w:t>
-      </w:r>
-      <w:r>
-        <w:t xml:space="preserve">pf, tcp_wrappers, OpenPGP, SSL/TLS, Logical Volume</w:t>
-      </w:r>
-      <w:r>
-        <w:t xml:space="preserve"> </w:t>
-      </w:r>
-      <w:r>
-        <w:t xml:space="preserve">Manager, btrfs, DRBD, Software RAID, ZFS, IPsec OpenSWAN</w:t>
-      </w:r>
-      <w:r>
-        <w:t xml:space="preserve"> </w:t>
-      </w:r>
-      <w:r>
-        <w:t xml:space="preserve">and racoon, OpenVPN, Wireguard, iDRAC, ILOM, IPMI</w:t>
+        <w:t xml:space="preserve">Git, AWS (cloud),</w:t>
+      </w:r>
+      <w:r>
+        <w:t xml:space="preserve"> </w:t>
+      </w:r>
+      <w:r>
+        <w:t xml:space="preserve">Kubernetes, Docker, Podman, KVM, Xen, IPv4, IPv6, Linux</w:t>
+      </w:r>
+      <w:r>
+        <w:t xml:space="preserve"> </w:t>
+      </w:r>
+      <w:r>
+        <w:t xml:space="preserve">Netfilter, ipfilter, OpenBSD pf, tcp_wrappers, OpenPGP,</w:t>
+      </w:r>
+      <w:r>
+        <w:t xml:space="preserve"> </w:t>
+      </w:r>
+      <w:r>
+        <w:t xml:space="preserve">SSL/TLS, Logical Volume Manager, btrfs, DRBD, Software</w:t>
+      </w:r>
+      <w:r>
+        <w:t xml:space="preserve"> </w:t>
+      </w:r>
+      <w:r>
+        <w:t xml:space="preserve">RAID, ZFS, IPsec OpenSWAN and racoon, OpenVPN,</w:t>
+      </w:r>
+      <w:r>
+        <w:t xml:space="preserve"> </w:t>
+      </w:r>
+      <w:r>
+        <w:t xml:space="preserve">Wireguard, iDRAC, ILOM, IPMI</w:t>
       </w:r>
     </w:p>
     <w:p>

</xml_diff>